<commit_message>
added 2 posts for kbs
</commit_message>
<xml_diff>
--- a/kbs/Фракции/Ростер юнитов/Демоны - ростер.docx
+++ b/kbs/Фракции/Ростер юнитов/Демоны - ростер.docx
@@ -117,51 +117,14 @@
       </w:r>
     </w:p>
     <w:p>
-      <w:proofErr w:type="spellStart"/>
-      <w:r>
-        <w:t>Ростер</w:t>
-      </w:r>
-      <w:proofErr w:type="spellEnd"/>
-      <w:r>
-        <w:t xml:space="preserve"> демонических юнитов концентрируется вокруг </w:t>
-      </w:r>
-      <w:proofErr w:type="spellStart"/>
-      <w:r>
-        <w:t>двуклеточных</w:t>
-      </w:r>
-      <w:proofErr w:type="spellEnd"/>
-      <w:r>
-        <w:t xml:space="preserve"> мощных демонов. Более того, у них на самом деле </w:t>
+      <w:r>
+        <w:t xml:space="preserve">Ростер демонических юнитов концентрируется вокруг двуклеточных мощных демонов. Более того, у них на самом деле </w:t>
       </w:r>
       <w:r>
         <w:t>две</w:t>
       </w:r>
       <w:r>
-        <w:t xml:space="preserve"> «</w:t>
-      </w:r>
-      <w:proofErr w:type="spellStart"/>
-      <w:r>
-        <w:t>двуклеточные</w:t>
-      </w:r>
-      <w:proofErr w:type="spellEnd"/>
-      <w:r>
-        <w:t xml:space="preserve">» ветви, с разными эффектами и способностями. Одноклеточные юниты обычно хрупки и концентрируются на массовом уроне или на специфических эффектах. Кроме того, у них нет «жреческой» ветви – её место занимают специфические демоны-имитаторы. Демоны очень сильно сконцентрированы на уроне огнём и повально от огня защищены, пусть и не </w:t>
-      </w:r>
-      <w:proofErr w:type="spellStart"/>
-      <w:r>
-        <w:t>имунны</w:t>
-      </w:r>
-      <w:proofErr w:type="spellEnd"/>
-      <w:r>
-        <w:t>. Есть юниты-</w:t>
-      </w:r>
-      <w:proofErr w:type="spellStart"/>
-      <w:r>
-        <w:t>призыватели</w:t>
-      </w:r>
-      <w:proofErr w:type="spellEnd"/>
-      <w:r>
-        <w:t xml:space="preserve"> без ограничения по зарядам, но с зависимостью от места на поле боя.</w:t>
+        <w:t xml:space="preserve"> «двуклеточные» ветви, с разными эффектами и способностями. Одноклеточные юниты обычно хрупки и концентрируются на массовом уроне или на специфических эффектах. Кроме того, у них нет «жреческой» ветви – её место занимают специфические демоны-имитаторы. Демоны очень сильно сконцентрированы на уроне огнём и повально от огня защищены, пусть и не имунны. Есть юниты-призыватели без ограничения по зарядам, но с зависимостью от места на поле боя.</w:t>
       </w:r>
     </w:p>
     <w:p>
@@ -183,25 +146,12 @@
     </w:p>
     <w:p>
       <w:r>
-        <w:t xml:space="preserve">+ Мощные заклинатели, от прямолинейных магов до имитаторов и </w:t>
-      </w:r>
-      <w:proofErr w:type="spellStart"/>
-      <w:r>
-        <w:t>превращателей</w:t>
-      </w:r>
-      <w:proofErr w:type="spellEnd"/>
-    </w:p>
-    <w:p>
-      <w:r>
-        <w:t xml:space="preserve">+ Лучший выбор </w:t>
-      </w:r>
-      <w:proofErr w:type="spellStart"/>
-      <w:r>
-        <w:t>двухклеточных</w:t>
-      </w:r>
-      <w:proofErr w:type="spellEnd"/>
-      <w:r>
-        <w:t xml:space="preserve"> юнитов</w:t>
+        <w:t>+ Мощные заклинатели, от прямолинейных магов до имитаторов и превращателей</w:t>
+      </w:r>
+    </w:p>
+    <w:p>
+      <w:r>
+        <w:t>+ Лучший выбор двухклеточных юнитов</w:t>
       </w:r>
     </w:p>
     <w:p>
@@ -234,28 +184,12 @@
     </w:p>
     <w:p>
       <w:r>
-        <w:t xml:space="preserve">- Практически нет стрелков, </w:t>
-      </w:r>
-      <w:proofErr w:type="gramStart"/>
-      <w:r>
-        <w:t>те</w:t>
-      </w:r>
-      <w:proofErr w:type="gramEnd"/>
-      <w:r>
-        <w:t xml:space="preserve"> что есть – конкурируют по клеткам с рукопашниками</w:t>
-      </w:r>
-    </w:p>
-    <w:p>
-      <w:r>
-        <w:t xml:space="preserve">- Очень легко </w:t>
-      </w:r>
-      <w:proofErr w:type="spellStart"/>
-      <w:r>
-        <w:t>контрящаяся</w:t>
-      </w:r>
-      <w:proofErr w:type="spellEnd"/>
-      <w:r>
-        <w:t xml:space="preserve"> магия, завязанная на огонь</w:t>
+        <w:t>- Практически нет стрелков, те что есть – конкурируют по клеткам с рукопашниками</w:t>
+      </w:r>
+    </w:p>
+    <w:p>
+      <w:r>
+        <w:t>- Очень легко контрящаяся магия, завязанная на огонь</w:t>
       </w:r>
     </w:p>
     <w:p>
@@ -273,15 +207,7 @@
     </w:p>
     <w:p>
       <w:r>
-        <w:t xml:space="preserve">- Механики полёта </w:t>
-      </w:r>
-      <w:proofErr w:type="gramStart"/>
-      <w:r>
-        <w:t>хуже</w:t>
-      </w:r>
-      <w:proofErr w:type="gramEnd"/>
-      <w:r>
-        <w:t xml:space="preserve"> чем у других фракций</w:t>
+        <w:t>- Механики полёта хуже чем у других фракций</w:t>
       </w:r>
     </w:p>
     <w:p/>
@@ -329,15 +255,7 @@
     </w:p>
     <w:p>
       <w:r>
-        <w:t>- Копирование.  Юнит-</w:t>
-      </w:r>
-      <w:proofErr w:type="spellStart"/>
-      <w:r>
-        <w:t>доппельгангер</w:t>
-      </w:r>
-      <w:proofErr w:type="spellEnd"/>
-      <w:r>
-        <w:t xml:space="preserve"> может перевоплотится в копию вражеского юнита, теряя первый ход.</w:t>
+        <w:t>- Копирование.  Юнит-доппельгангер может перевоплотится в копию вражеского юнита, теряя первый ход.</w:t>
       </w:r>
     </w:p>
     <w:p>
@@ -345,15 +263,7 @@
         <w:t>- Всепожирающее пламя. Демоническая атака огнём, остановленная оберегом, оставляет на юните урон со временем на 2 хода, с четвертью урона от атаки.</w:t>
       </w:r>
       <w:r>
-        <w:t xml:space="preserve"> Если юнит </w:t>
-      </w:r>
-      <w:proofErr w:type="spellStart"/>
-      <w:r>
-        <w:t>иммунен</w:t>
-      </w:r>
-      <w:proofErr w:type="spellEnd"/>
-      <w:r>
-        <w:t xml:space="preserve"> к огню – 10% урона всё равно пройдут.</w:t>
+        <w:t xml:space="preserve"> Если юнит иммунен к огню – 10% урона всё равно пройдут.</w:t>
       </w:r>
     </w:p>
     <w:p>
@@ -363,15 +273,7 @@
     </w:p>
     <w:p>
       <w:r>
-        <w:t xml:space="preserve">- Соблазнение. Атака разумом, которая срывает с противника все обереги, блокирующую стойку и защиту. Сама по себе урона не наносит и не может </w:t>
-      </w:r>
-      <w:proofErr w:type="spellStart"/>
-      <w:r>
-        <w:t>прокнуть</w:t>
-      </w:r>
-      <w:proofErr w:type="spellEnd"/>
-      <w:r>
-        <w:t xml:space="preserve"> за бой дважды на одном и том же юните.</w:t>
+        <w:t>- Соблазнение. Атака разумом, которая срывает с противника все обереги, блокирующую стойку и защиту. Сама по себе урона не наносит и не может прокнуть за бой дважды на одном и том же юните.</w:t>
       </w:r>
       <w:r>
         <w:t xml:space="preserve"> </w:t>
@@ -414,49 +316,17 @@
     </w:p>
     <w:p>
       <w:r>
-        <w:t xml:space="preserve">- Высший пожиратель. Демон-рукопашник, во многом похожий на обычного героя-воина. Поглощает часть вражеского </w:t>
-      </w:r>
-      <w:proofErr w:type="spellStart"/>
-      <w:r>
-        <w:t>хп</w:t>
-      </w:r>
-      <w:proofErr w:type="spellEnd"/>
-      <w:r>
-        <w:t xml:space="preserve"> при каждом ударе, с уровнями может разогнать способность, превратив её в процентную. Доступен тяжёлый полёт</w:t>
-      </w:r>
-    </w:p>
-    <w:p>
-      <w:r>
-        <w:t xml:space="preserve">- Высший </w:t>
-      </w:r>
-      <w:proofErr w:type="spellStart"/>
-      <w:r>
-        <w:t>пронзатель</w:t>
-      </w:r>
-      <w:proofErr w:type="spellEnd"/>
-      <w:r>
-        <w:t>. Демон-стрелок, с низким уроном от выстрела, но с большим количеством эффектов при попадании на выбор – от прикрепления к месту до урона со временем. Доступен тяжёлый полёт, с уровнями он может научится стрелять из тяжёлого полёта.</w:t>
-      </w:r>
-    </w:p>
-    <w:p>
-      <w:r>
-        <w:t xml:space="preserve">- Высший </w:t>
-      </w:r>
-      <w:proofErr w:type="spellStart"/>
-      <w:r>
-        <w:t>душекрад</w:t>
-      </w:r>
-      <w:proofErr w:type="spellEnd"/>
-      <w:r>
-        <w:t xml:space="preserve">. Демон-маг, умеющий за счёт убитых врагов разгонять количество </w:t>
-      </w:r>
-      <w:proofErr w:type="spellStart"/>
-      <w:r>
-        <w:t>скастованных</w:t>
-      </w:r>
-      <w:proofErr w:type="spellEnd"/>
-      <w:r>
-        <w:t xml:space="preserve"> заклинаний (+1 заклинание за каждого добитого, с уровнями – за каждого умершего за прошлый ход в принципе).</w:t>
+        <w:t>- Высший пожиратель. Демон-рукопашник, во многом похожий на обычного героя-воина. Поглощает часть вражеского хп при каждом ударе, с уровнями может разогнать способность, превратив её в процентную. Доступен тяжёлый полёт</w:t>
+      </w:r>
+    </w:p>
+    <w:p>
+      <w:r>
+        <w:t>- Высший пронзатель. Демон-стрелок, с низким уроном от выстрела, но с большим количеством эффектов при попадании на выбор – от прикрепления к месту до урона со временем. Доступен тяжёлый полёт, с уровнями он может научится стрелять из тяжёлого полёта.</w:t>
+      </w:r>
+    </w:p>
+    <w:p>
+      <w:r>
+        <w:t>- Высший душекрад. Демон-маг, умеющий за счёт убитых врагов разгонять количество скастованных заклинаний (+1 заклинание за каждого добитого, с уровнями – за каждого умершего за прошлый ход в принципе).</w:t>
       </w:r>
     </w:p>
     <w:p/>
@@ -482,15 +352,7 @@
     </w:p>
     <w:p>
       <w:r>
-        <w:t xml:space="preserve">Делится на две ветки – пожирателей (восстанавливают здоровье при ударах) и летунов (специальная ветвь – адаптация к </w:t>
-      </w:r>
-      <w:proofErr w:type="spellStart"/>
-      <w:r>
-        <w:t>птицелюдям</w:t>
-      </w:r>
-      <w:proofErr w:type="spellEnd"/>
-      <w:r>
-        <w:t>)</w:t>
+        <w:t>Делится на две ветки – пожирателей (восстанавливают здоровье при ударах) и летунов (специальная ветвь – адаптация к птицелюдям)</w:t>
       </w:r>
     </w:p>
     <w:p>
@@ -569,15 +431,7 @@
         <w:t xml:space="preserve">хорошо </w:t>
       </w:r>
       <w:r>
-        <w:t xml:space="preserve">летать, имеет механику сохранения </w:t>
-      </w:r>
-      <w:proofErr w:type="spellStart"/>
-      <w:r>
-        <w:t>птицелюдей</w:t>
-      </w:r>
-      <w:proofErr w:type="spellEnd"/>
-      <w:r>
-        <w:t xml:space="preserve"> (убегает вместо получения фатального удара). В полёте не теряет урона.</w:t>
+        <w:t>летать, имеет механику сохранения птицелюдей (убегает вместо получения фатального удара). В полёте не теряет урона.</w:t>
       </w:r>
       <w:r>
         <w:t xml:space="preserve"> Умеет атаковать при выходе из полёта.</w:t>
@@ -590,15 +444,7 @@
     </w:p>
     <w:p>
       <w:r>
-        <w:t xml:space="preserve"> Может летать, имеет механику сохранения </w:t>
-      </w:r>
-      <w:proofErr w:type="spellStart"/>
-      <w:r>
-        <w:t>птицелюдей</w:t>
-      </w:r>
-      <w:proofErr w:type="spellEnd"/>
-      <w:r>
-        <w:t xml:space="preserve"> (убегает вместо получения фатального удара). В полёте не теряет урона, более того, может раз за бой выбрать цель, по которой будет наносить двойной урон</w:t>
+        <w:t xml:space="preserve"> Может летать, имеет механику сохранения птицелюдей (убегает вместо получения фатального удара). В полёте не теряет урона, более того, может раз за бой выбрать цель, по которой будет наносить двойной урон</w:t>
       </w:r>
       <w:r>
         <w:t>.</w:t>
@@ -621,39 +467,7 @@
     </w:p>
     <w:p>
       <w:r>
-        <w:t xml:space="preserve"> Это очень странная ветка, в которой стрелок один и он скорее маг. Остальные побочные ветки – это специфические версии магических юнитов и даже </w:t>
-      </w:r>
-      <w:proofErr w:type="spellStart"/>
-      <w:r>
-        <w:t>доппельгангер</w:t>
-      </w:r>
-      <w:proofErr w:type="spellEnd"/>
-      <w:r>
-        <w:t>. Ветки – «</w:t>
-      </w:r>
-      <w:proofErr w:type="spellStart"/>
-      <w:r>
-        <w:t>огнешар</w:t>
-      </w:r>
-      <w:proofErr w:type="spellEnd"/>
-      <w:r>
-        <w:t xml:space="preserve">» - основная, </w:t>
-      </w:r>
-      <w:proofErr w:type="spellStart"/>
-      <w:r>
-        <w:t>доппельгангер</w:t>
-      </w:r>
-      <w:proofErr w:type="spellEnd"/>
-      <w:r>
-        <w:t xml:space="preserve"> – побочная, </w:t>
-      </w:r>
-      <w:proofErr w:type="spellStart"/>
-      <w:r>
-        <w:t>превращатель</w:t>
-      </w:r>
-      <w:proofErr w:type="spellEnd"/>
-      <w:r>
-        <w:t xml:space="preserve"> – побочная.</w:t>
+        <w:t xml:space="preserve"> Это очень странная ветка, в которой стрелок один и он скорее маг. Остальные побочные ветки – это специфические версии магических юнитов и даже доппельгангер. Ветки – «огнешар» - основная, доппельгангер – побочная, превращатель – побочная.</w:t>
       </w:r>
     </w:p>
     <w:p>
@@ -671,52 +485,18 @@
     </w:p>
     <w:p>
       <w:r>
-        <w:t xml:space="preserve">Т1 – </w:t>
-      </w:r>
-      <w:proofErr w:type="spellStart"/>
-      <w:r>
-        <w:t>огнешар</w:t>
-      </w:r>
-      <w:proofErr w:type="spellEnd"/>
-      <w:r>
-        <w:t xml:space="preserve"> – Бес-</w:t>
-      </w:r>
-      <w:proofErr w:type="spellStart"/>
-      <w:r>
-        <w:t>огнеплюй</w:t>
-      </w:r>
-      <w:proofErr w:type="spellEnd"/>
-    </w:p>
-    <w:p>
-      <w:r>
-        <w:t xml:space="preserve"> Получает </w:t>
-      </w:r>
-      <w:proofErr w:type="spellStart"/>
-      <w:r>
-        <w:t>пассивку</w:t>
-      </w:r>
-      <w:proofErr w:type="spellEnd"/>
-      <w:r>
-        <w:t xml:space="preserve"> «всепожирающее пламя». </w:t>
-      </w:r>
-    </w:p>
-    <w:p>
-      <w:r>
-        <w:t xml:space="preserve">Т2 – </w:t>
-      </w:r>
-      <w:proofErr w:type="spellStart"/>
-      <w:r>
-        <w:t>огнешар</w:t>
-      </w:r>
-      <w:proofErr w:type="spellEnd"/>
-      <w:r>
-        <w:t xml:space="preserve"> – </w:t>
-      </w:r>
-      <w:proofErr w:type="spellStart"/>
-      <w:r>
-        <w:t>Фламий</w:t>
-      </w:r>
-      <w:proofErr w:type="spellEnd"/>
+        <w:t>Т1 – огнешар – Бес-огнеплюй</w:t>
+      </w:r>
+    </w:p>
+    <w:p>
+      <w:r>
+        <w:t xml:space="preserve"> Получает пассивку «всепожирающее пламя». </w:t>
+      </w:r>
+    </w:p>
+    <w:p>
+      <w:r>
+        <w:t>Т2 – огнешар – Фламий</w:t>
+      </w:r>
     </w:p>
     <w:p>
       <w:r>
@@ -728,21 +508,8 @@
     </w:p>
     <w:p>
       <w:r>
-        <w:t xml:space="preserve">Т3 – </w:t>
-      </w:r>
-      <w:proofErr w:type="spellStart"/>
-      <w:r>
-        <w:t>огнешар</w:t>
-      </w:r>
-      <w:proofErr w:type="spellEnd"/>
-      <w:r>
-        <w:t xml:space="preserve"> – </w:t>
-      </w:r>
-      <w:proofErr w:type="spellStart"/>
-      <w:r>
-        <w:t>Инцендий</w:t>
-      </w:r>
-      <w:proofErr w:type="spellEnd"/>
+        <w:t>Т3 – огнешар – Инцендий</w:t>
+      </w:r>
     </w:p>
     <w:p>
       <w:r>
@@ -754,108 +521,29 @@
     </w:p>
     <w:p>
       <w:r>
-        <w:t xml:space="preserve">Т1 – </w:t>
-      </w:r>
-      <w:proofErr w:type="spellStart"/>
-      <w:r>
-        <w:t>Доппельгангер</w:t>
-      </w:r>
-      <w:proofErr w:type="spellEnd"/>
-    </w:p>
-    <w:p>
-      <w:r>
-        <w:t xml:space="preserve"> Превращается в любого подходящего по </w:t>
-      </w:r>
-      <w:proofErr w:type="spellStart"/>
-      <w:r>
-        <w:t>клеточности</w:t>
-      </w:r>
-      <w:proofErr w:type="spellEnd"/>
-      <w:r>
-        <w:t xml:space="preserve"> юнита на поле боя (включая дружественных). Имеет 75 инициативы, практически наибольшая в игре. Превращение даёт только базовые </w:t>
-      </w:r>
-      <w:proofErr w:type="spellStart"/>
-      <w:r>
-        <w:t>статы</w:t>
-      </w:r>
-      <w:proofErr w:type="spellEnd"/>
-      <w:r>
-        <w:t xml:space="preserve"> юнита, но сам </w:t>
-      </w:r>
-      <w:proofErr w:type="spellStart"/>
-      <w:r>
-        <w:t>доппельгангер</w:t>
-      </w:r>
-      <w:proofErr w:type="spellEnd"/>
-      <w:r>
-        <w:t xml:space="preserve"> может их усилить – его опыт пересчитывается в опыт юнита как 1/уровень копируемого юнита. Таким образом очень опытный </w:t>
-      </w:r>
-      <w:proofErr w:type="spellStart"/>
-      <w:r>
-        <w:t>доппельгангер</w:t>
-      </w:r>
-      <w:proofErr w:type="spellEnd"/>
-      <w:r>
-        <w:t xml:space="preserve"> будет </w:t>
-      </w:r>
-      <w:proofErr w:type="gramStart"/>
-      <w:r>
-        <w:t>лучше</w:t>
-      </w:r>
-      <w:proofErr w:type="gramEnd"/>
-      <w:r>
-        <w:t xml:space="preserve"> чем скопированный юнит.</w:t>
-      </w:r>
-    </w:p>
-    <w:p>
-      <w:r>
-        <w:t xml:space="preserve">Т1 – </w:t>
-      </w:r>
-      <w:proofErr w:type="spellStart"/>
-      <w:r>
-        <w:t>превращатели</w:t>
-      </w:r>
-      <w:proofErr w:type="spellEnd"/>
-      <w:r>
-        <w:t xml:space="preserve"> – </w:t>
-      </w:r>
-      <w:proofErr w:type="spellStart"/>
-      <w:r>
-        <w:t>Исказитель</w:t>
-      </w:r>
-      <w:proofErr w:type="spellEnd"/>
-    </w:p>
-    <w:p>
-      <w:r>
-        <w:t xml:space="preserve">Теряет атаку, вместо этого обучается превращать врагов (до Т2 включительно) в бесов. Они сохраняют все характеристики кроме урона и способностей. Длительность превращения - до следующего хода </w:t>
-      </w:r>
-      <w:proofErr w:type="spellStart"/>
-      <w:r>
-        <w:t>исказителя</w:t>
-      </w:r>
-      <w:proofErr w:type="spellEnd"/>
-      <w:r>
-        <w:t>.</w:t>
+        <w:t>Т1 – Доппельгангер</w:t>
+      </w:r>
+    </w:p>
+    <w:p>
+      <w:r>
+        <w:t xml:space="preserve"> Превращается в любого подходящего по клеточности юнита на поле боя (включая дружественных). Имеет 75 инициативы, практически наибольшая в игре. Превращение даёт только базовые статы юнита, но сам доппельгангер может их усилить – его опыт пересчитывается в опыт юнита как 1/уровень копируемого юнита. Таким образом очень опытный доппельгангер будет лучше чем скопированный юнит.</w:t>
+      </w:r>
+    </w:p>
+    <w:p>
+      <w:r>
+        <w:t>Т1 – превращатели – Исказитель</w:t>
+      </w:r>
+    </w:p>
+    <w:p>
+      <w:r>
+        <w:t>Теряет атаку, вместо этого обучается превращать врагов (до Т2 включительно) в бесов. Они сохраняют все характеристики кроме урона и способностей. Длительность превращения - до следующего хода исказителя.</w:t>
       </w:r>
     </w:p>
     <w:p>
       <w:r>
         <w:lastRenderedPageBreak/>
-        <w:t xml:space="preserve">Т2 – </w:t>
-      </w:r>
-      <w:proofErr w:type="spellStart"/>
-      <w:r>
-        <w:t>превращатели</w:t>
-      </w:r>
-      <w:proofErr w:type="spellEnd"/>
-      <w:r>
-        <w:t xml:space="preserve"> – </w:t>
-      </w:r>
-      <w:proofErr w:type="spellStart"/>
-      <w:r>
-        <w:t>Фальсарий</w:t>
-      </w:r>
-      <w:proofErr w:type="spellEnd"/>
+        <w:t>Т2 – превращатели – Фальсарий</w:t>
+      </w:r>
     </w:p>
     <w:p>
       <w:r>
@@ -863,35 +551,14 @@
       </w:r>
       <w:bookmarkStart w:id="0" w:name="_Hlk204207031"/>
       <w:r>
-        <w:t xml:space="preserve">Каждый </w:t>
-      </w:r>
-      <w:proofErr w:type="gramStart"/>
-      <w:r>
-        <w:t>раз</w:t>
-      </w:r>
-      <w:proofErr w:type="gramEnd"/>
-      <w:r>
-        <w:t xml:space="preserve"> когда превращение должно спасть, есть шанс что оно продлится ещё на ход (шанс равен трети точности при прошлом наложении превращения, т.е. продлеваться превращение может несколько раз). </w:t>
+        <w:t xml:space="preserve">Каждый раз когда превращение должно спасть, есть шанс что оно продлится ещё на ход (шанс равен трети точности при прошлом наложении превращения, т.е. продлеваться превращение может несколько раз). </w:t>
       </w:r>
       <w:bookmarkEnd w:id="0"/>
     </w:p>
     <w:p>
       <w:r>
-        <w:t xml:space="preserve"> Т3 – </w:t>
-      </w:r>
-      <w:proofErr w:type="spellStart"/>
-      <w:r>
-        <w:t>превращатели</w:t>
-      </w:r>
-      <w:proofErr w:type="spellEnd"/>
-      <w:r>
-        <w:t xml:space="preserve"> – </w:t>
-      </w:r>
-      <w:proofErr w:type="spellStart"/>
-      <w:r>
-        <w:t>Корругаций</w:t>
-      </w:r>
-      <w:proofErr w:type="spellEnd"/>
+        <w:t xml:space="preserve"> Т3 – превращатели – Корругаций</w:t>
+      </w:r>
     </w:p>
     <w:p>
       <w:r>
@@ -935,280 +602,347 @@
     <w:p>
       <w:r>
         <w:t>Атакует в воздухе</w:t>
+      </w:r>
+    </w:p>
+    <w:p>
+      <w:r>
+        <w:t>Т2 – Иллюмий</w:t>
+      </w:r>
+    </w:p>
+    <w:p>
+      <w:r>
+        <w:t>Получает «всепожирающее пламя» и несколько видов огненной атаки (огненный шар, точечная). Может раздавать обереги дружественным войскам.</w:t>
+      </w:r>
+    </w:p>
+    <w:p>
+      <w:r>
+        <w:t>Т3 – Маледикта игний</w:t>
+      </w:r>
+    </w:p>
+    <w:p>
+      <w:r>
+        <w:t>Умеет проклинать врагов точечно – понижая инициативу, точность или защиту на выбор на 1 ход. Каждое из проклятий накладывает эффект поджога</w:t>
+      </w:r>
+      <w:r>
+        <w:t xml:space="preserve"> (аналогичный всепожирающему пламени)</w:t>
+      </w:r>
+    </w:p>
+    <w:p>
+      <w:r>
+        <w:t>Т4 – Инферний</w:t>
+      </w:r>
+    </w:p>
+    <w:p>
+      <w:r>
+        <w:t>Обучается ультимативным заклинаниям – может поджечь всех врагов, парализовать врага на котором есть эффект горения, привязать врагов к месту, нанести урон своим юнитам и удвоить их урон.</w:t>
+      </w:r>
+    </w:p>
+    <w:p>
+      <w:r>
+        <w:t>Т</w:t>
+      </w:r>
+      <w:r>
+        <w:t>2</w:t>
+      </w:r>
+      <w:r>
+        <w:t xml:space="preserve"> – суккуб – Обольститель</w:t>
+      </w:r>
+    </w:p>
+    <w:p>
+      <w:r>
+        <w:t xml:space="preserve">Обольщает врагов. </w:t>
+      </w:r>
+    </w:p>
+    <w:p>
+      <w:r>
+        <w:t>Т3 – ужас – Владыка страха</w:t>
+      </w:r>
+    </w:p>
+    <w:p>
+      <w:r>
+        <w:t xml:space="preserve">Теряет атаку. Может окаменять врага с </w:t>
+      </w:r>
+      <w:r>
+        <w:t>7</w:t>
+      </w:r>
+      <w:r>
+        <w:t xml:space="preserve">0% точностью. </w:t>
+      </w:r>
+      <w:r>
+        <w:t xml:space="preserve">Может дематериализовать одного врага (тот сможет потом вернуться обратно, но потеряет ход). </w:t>
+      </w:r>
+      <w:r>
+        <w:t>Может прогнать одного врага с поля боя, получив штраф к точности до конца боя.</w:t>
+      </w:r>
+    </w:p>
+    <w:p>
+      <w:r>
+        <w:t>Жрецы</w:t>
+      </w:r>
+      <w:r>
+        <w:t xml:space="preserve"> 6</w:t>
+      </w:r>
+    </w:p>
+    <w:p>
+      <w:r>
+        <w:t xml:space="preserve"> Не имеет в себе саппортов – это специфичная ветвь, в которой прячется </w:t>
+      </w:r>
+      <w:r>
+        <w:t xml:space="preserve">две адаптации двуклеточных демонов – Штурмовики (гномы) и Таранщики (империя). </w:t>
+      </w:r>
+    </w:p>
+    <w:p>
+      <w:r>
+        <w:t xml:space="preserve">Т0 – </w:t>
+      </w:r>
+      <w:r>
+        <w:t>Чёрт авангарда</w:t>
+      </w:r>
+    </w:p>
+    <w:p>
+      <w:r>
+        <w:t xml:space="preserve"> «Защитная» версия двухклеточного демона – бронирована, но наносит мало урона.</w:t>
+      </w:r>
+    </w:p>
+    <w:p>
+      <w:r>
+        <w:t>Т1 – Демон-латник</w:t>
+      </w:r>
+    </w:p>
+    <w:p>
+      <w:r>
+        <w:t>Т2 – штурмовики – Демон-штурмовик</w:t>
+      </w:r>
+    </w:p>
+    <w:p>
+      <w:r>
+        <w:lastRenderedPageBreak/>
+        <w:t>Получает бронебойный урон. Иммунен к огню, земле и разуму.</w:t>
+      </w:r>
+    </w:p>
+    <w:p>
+      <w:r>
+        <w:t>Т4 – штурмовики – Штурмовик-разоритель</w:t>
+      </w:r>
+    </w:p>
+    <w:p>
+      <w:r>
+        <w:t xml:space="preserve"> Улучшает </w:t>
+      </w:r>
+      <w:r>
+        <w:t>защитную стойку – если начал ход в защитной стойке, то следующая атака нанесёт от 1</w:t>
+      </w:r>
+      <w:r>
+        <w:t>2</w:t>
+      </w:r>
+      <w:r>
+        <w:t>5</w:t>
+      </w:r>
+      <w:r>
+        <w:t xml:space="preserve"> до </w:t>
+      </w:r>
+      <w:r>
+        <w:t>20</w:t>
+      </w:r>
+      <w:r>
+        <w:t>0% урона.</w:t>
+      </w:r>
+    </w:p>
+    <w:p>
+      <w:r>
+        <w:t>Т2 – таран – Кошмарный всадник</w:t>
+      </w:r>
+    </w:p>
+    <w:p>
+      <w:r>
+        <w:t xml:space="preserve"> Теряет броню, получает свойство кавалерии.</w:t>
+      </w:r>
+    </w:p>
+    <w:p>
+      <w:r>
+        <w:t xml:space="preserve">Т3 – таран – Сотрясатель </w:t>
+      </w:r>
+    </w:p>
+    <w:p>
+      <w:r>
+        <w:t xml:space="preserve"> Получает иммунитет к разуму, воздуху, воде.</w:t>
+      </w:r>
+    </w:p>
+    <w:p>
+      <w:r>
+        <w:t>Т4 – таран – Покоритель</w:t>
+      </w:r>
+    </w:p>
+    <w:p>
+      <w:r>
+        <w:t xml:space="preserve"> При атаке с разгона может мгновенно убить цель, если у неё остаётся меньше определённого запаса здоровья (растёт с уровнями). Если убивает, встаёт на её место.</w:t>
+      </w:r>
+    </w:p>
+    <w:p/>
+    <w:p>
+      <w:r>
+        <w:t>Крупные демоны</w:t>
+      </w:r>
+      <w:r>
+        <w:t xml:space="preserve"> 7</w:t>
+      </w:r>
+    </w:p>
+    <w:p>
+      <w:r>
+        <w:t xml:space="preserve"> </w:t>
+      </w:r>
+      <w:r>
+        <w:t xml:space="preserve">В отличии от прошлой ветки, слабобронированны, но имеют высокий урон и много хп. </w:t>
+      </w:r>
+      <w:r>
+        <w:t>Имеют всего 3 ветки, взятых из классической игры. Все достигают ультимативной версии и имеют дополнительные способности.</w:t>
+      </w:r>
+      <w:r>
+        <w:t xml:space="preserve"> Ветки – </w:t>
+      </w:r>
+      <w:r>
+        <w:t>контроль</w:t>
+      </w:r>
+      <w:r>
+        <w:t>, поджог, массовая атака</w:t>
+      </w:r>
+      <w:r>
+        <w:t>. Контрольная ветка имеет низкий шанс на накидывание контроля (50% на окаменение), но при этом продляет любые дебаффы и доты при ударе. Поджог-ветка предлагает ультимативный урон, совмещённый с дотом, и даёт возможность без потерь урона бить одного юнита. Массово-атакующая ветка наносит сравнительно низкий урон, зато синергирует с дебаффами и контролем.</w:t>
+      </w:r>
+    </w:p>
+    <w:p>
+      <w:r>
+        <w:t>Т0 – Чёрт</w:t>
+      </w:r>
+    </w:p>
+    <w:p>
+      <w:r>
+        <w:t>Агрессивная версия демона – много урона, мало здоровья для такой туши.</w:t>
+      </w:r>
+      <w:r>
+        <w:t xml:space="preserve"> Имеет «Тяжёлый полёт».</w:t>
+      </w:r>
+    </w:p>
+    <w:p>
+      <w:r>
+        <w:t xml:space="preserve">Т1 </w:t>
+      </w:r>
+      <w:r>
+        <w:t>–</w:t>
+      </w:r>
+      <w:r>
+        <w:t xml:space="preserve"> </w:t>
+      </w:r>
+      <w:r>
+        <w:t>Демон</w:t>
+      </w:r>
+    </w:p>
+    <w:p>
+      <w:r>
+        <w:t>Просто более толстая версия Чёрта. Имеет «Тяжёлый полёт».</w:t>
+      </w:r>
+      <w:r>
+        <w:t xml:space="preserve"> </w:t>
+      </w:r>
+      <w:r>
+        <w:t>Имуннен к огню.</w:t>
       </w:r>
       <w:bookmarkStart w:id="1" w:name="_GoBack"/>
       <w:bookmarkEnd w:id="1"/>
     </w:p>
     <w:p>
       <w:r>
-        <w:t xml:space="preserve">Т2 – </w:t>
-      </w:r>
-      <w:proofErr w:type="spellStart"/>
-      <w:r>
-        <w:t>Иллюмий</w:t>
-      </w:r>
-      <w:proofErr w:type="spellEnd"/>
-    </w:p>
-    <w:p>
-      <w:r>
-        <w:t>Получает «всепожирающее пламя» и несколько видов огненной атаки (огненный шар, точечная). Может раздавать обереги дружественным войскам.</w:t>
-      </w:r>
-    </w:p>
-    <w:p>
-      <w:r>
-        <w:t xml:space="preserve">Т3 – </w:t>
-      </w:r>
-      <w:proofErr w:type="spellStart"/>
-      <w:r>
-        <w:t>Маледикта</w:t>
-      </w:r>
-      <w:proofErr w:type="spellEnd"/>
+        <w:t>Т2 – Диссектор</w:t>
+      </w:r>
+    </w:p>
+    <w:p>
+      <w:r>
+        <w:t xml:space="preserve"> Ещё более мощная версия. Наносит бонусный урон (25%) если бьёт по противнику под отрицательным эффектом. Имеет «Тяжёлый полёт».</w:t>
+      </w:r>
       <w:r>
         <w:t xml:space="preserve"> </w:t>
       </w:r>
-      <w:proofErr w:type="spellStart"/>
-      <w:r>
-        <w:t>игний</w:t>
-      </w:r>
-      <w:proofErr w:type="spellEnd"/>
-    </w:p>
-    <w:p>
-      <w:r>
-        <w:t>Умеет проклинать врагов точечно – понижая инициативу, точность или защиту на выбор на 1 ход. Каждое из проклятий накладывает эффект поджога</w:t>
-      </w:r>
-      <w:r>
-        <w:t xml:space="preserve"> (аналогичный всепожирающему пламени)</w:t>
-      </w:r>
-    </w:p>
-    <w:p>
-      <w:r>
-        <w:t xml:space="preserve">Т4 – </w:t>
-      </w:r>
-      <w:proofErr w:type="spellStart"/>
-      <w:r>
-        <w:t>Инферний</w:t>
-      </w:r>
-      <w:proofErr w:type="spellEnd"/>
-    </w:p>
-    <w:p>
-      <w:r>
-        <w:t xml:space="preserve">Обучается ультимативным заклинаниям – может поджечь всех врагов, парализовать </w:t>
-      </w:r>
-      <w:proofErr w:type="gramStart"/>
-      <w:r>
-        <w:t>врага</w:t>
-      </w:r>
-      <w:proofErr w:type="gramEnd"/>
-      <w:r>
-        <w:t xml:space="preserve"> на котором есть эффект горения, привязать врагов к месту, нанести урон своим юнитам и удвоить их урон.</w:t>
-      </w:r>
-    </w:p>
-    <w:p>
-      <w:r>
-        <w:t>Т</w:t>
-      </w:r>
-      <w:r>
-        <w:t>2</w:t>
-      </w:r>
-      <w:r>
-        <w:t xml:space="preserve"> – суккуб – Обольститель</w:t>
-      </w:r>
-    </w:p>
-    <w:p>
-      <w:r>
-        <w:t xml:space="preserve">Обольщает врагов. </w:t>
-      </w:r>
-    </w:p>
-    <w:p>
-      <w:r>
-        <w:t>Т3 – ужас – Владыка страха</w:t>
-      </w:r>
-    </w:p>
-    <w:p>
-      <w:r>
-        <w:t xml:space="preserve">Теряет атаку. Может </w:t>
-      </w:r>
-      <w:proofErr w:type="spellStart"/>
-      <w:r>
-        <w:t>окаменять</w:t>
-      </w:r>
-      <w:proofErr w:type="spellEnd"/>
-      <w:r>
-        <w:t xml:space="preserve"> врага с </w:t>
-      </w:r>
-      <w:r>
-        <w:t>7</w:t>
-      </w:r>
-      <w:r>
-        <w:t xml:space="preserve">0% точностью. </w:t>
-      </w:r>
-      <w:r>
-        <w:t xml:space="preserve">Может дематериализовать одного врага (тот сможет потом вернуться обратно, но потеряет ход). </w:t>
-      </w:r>
-      <w:r>
-        <w:t>Может прогнать одного врага с поля боя, получив штраф к точности до конца боя.</w:t>
-      </w:r>
-    </w:p>
-    <w:p>
-      <w:r>
-        <w:t>Жрецы</w:t>
-      </w:r>
-      <w:r>
-        <w:t xml:space="preserve"> 6</w:t>
-      </w:r>
-    </w:p>
-    <w:p>
-      <w:r>
-        <w:t xml:space="preserve"> Не имеет в себе саппортов – это специфичная ветвь, в которой прячется </w:t>
-      </w:r>
-      <w:proofErr w:type="spellStart"/>
-      <w:r>
-        <w:t>доппельгангер</w:t>
-      </w:r>
-      <w:proofErr w:type="spellEnd"/>
-      <w:r>
-        <w:t xml:space="preserve"> (</w:t>
-      </w:r>
-      <w:proofErr w:type="spellStart"/>
-      <w:r>
-        <w:t>двуклеточный</w:t>
-      </w:r>
-      <w:proofErr w:type="spellEnd"/>
-      <w:r>
-        <w:t xml:space="preserve">) и две адаптации </w:t>
-      </w:r>
-      <w:proofErr w:type="spellStart"/>
-      <w:r>
-        <w:t>двуклеточных</w:t>
-      </w:r>
-      <w:proofErr w:type="spellEnd"/>
-      <w:r>
-        <w:t xml:space="preserve"> демонов – Штурмовики (гномы) и </w:t>
-      </w:r>
-      <w:proofErr w:type="spellStart"/>
-      <w:r>
-        <w:t>Таранщики</w:t>
-      </w:r>
-      <w:proofErr w:type="spellEnd"/>
-      <w:r>
-        <w:t xml:space="preserve"> (империя). </w:t>
-      </w:r>
-    </w:p>
-    <w:p>
-      <w:r>
-        <w:t xml:space="preserve">Т0 – </w:t>
-      </w:r>
-      <w:r>
-        <w:t>Чёрт авангарда</w:t>
-      </w:r>
-    </w:p>
-    <w:p>
-      <w:r>
-        <w:t xml:space="preserve"> «Защитная» версия </w:t>
-      </w:r>
-      <w:proofErr w:type="spellStart"/>
-      <w:r>
-        <w:t>двухклеточного</w:t>
-      </w:r>
-      <w:proofErr w:type="spellEnd"/>
-      <w:r>
-        <w:t xml:space="preserve"> демона – бронирована, но наносит мало урона.</w:t>
-      </w:r>
-    </w:p>
-    <w:p>
-      <w:r>
-        <w:t>Т1 – Демон-латник</w:t>
-      </w:r>
-    </w:p>
-    <w:p>
+    </w:p>
+    <w:p>
+      <w:r>
+        <w:t xml:space="preserve">Т3 </w:t>
+      </w:r>
+      <w:r>
+        <w:t>–</w:t>
+      </w:r>
+      <w:r>
+        <w:t xml:space="preserve"> </w:t>
+      </w:r>
+      <w:r>
+        <w:t>«массовая» ветка – Пронзатель</w:t>
+      </w:r>
+    </w:p>
+    <w:p>
+      <w:r>
+        <w:t xml:space="preserve"> Атакует всех врагов, физический урон. Наносит бонусный урон (25%) если бьёт по противнику под отрицательным эффектом.</w:t>
+      </w:r>
+      <w:r>
+        <w:t xml:space="preserve"> Низкая инициатива, иммунитет к магии земли</w:t>
+      </w:r>
+    </w:p>
+    <w:p>
+      <w:r>
+        <w:t>Т4 – «массовая» ветка – Герминарий</w:t>
+      </w:r>
+    </w:p>
+    <w:p>
+      <w:r>
+        <w:t xml:space="preserve"> Атакует всех врагов, физический урон. Наносит бонусный урон (25%) если бьёт по противнику под отрицательным эффектом. Срывает защитные стойки своим ударом (но урон не увеличивается).</w:t>
+      </w:r>
+    </w:p>
+    <w:p>
+      <w:r>
+        <w:t>Т3 – «огненная ветка» - Фламгладий</w:t>
+      </w:r>
+    </w:p>
+    <w:p>
+      <w:r>
+        <w:t xml:space="preserve"> Атакует одну цель, накладывает на неё урон со временем (огненный). </w:t>
+      </w:r>
+      <w:r>
+        <w:t>Этот урон со временем считается целью для «всепожирающего пламени» - если он остановлен оберегом</w:t>
+      </w:r>
+      <w:r>
+        <w:t>/иммунитетом</w:t>
+      </w:r>
+      <w:r>
+        <w:t xml:space="preserve">, </w:t>
+      </w:r>
       <w:r>
         <w:lastRenderedPageBreak/>
-        <w:t>Т2 – штурмовики – Демон-штурмовик</w:t>
-      </w:r>
-    </w:p>
-    <w:p>
-      <w:r>
-        <w:t xml:space="preserve">Получает бронебойный урон. </w:t>
-      </w:r>
-      <w:proofErr w:type="spellStart"/>
-      <w:r>
-        <w:t>Иммунен</w:t>
-      </w:r>
-      <w:proofErr w:type="spellEnd"/>
-      <w:r>
-        <w:t xml:space="preserve"> к огню, земле и разуму.</w:t>
-      </w:r>
-    </w:p>
-    <w:p>
-      <w:r>
-        <w:t>Т4 – штурмовики – Штурмовик-разоритель</w:t>
-      </w:r>
-    </w:p>
-    <w:p>
-      <w:r>
-        <w:t xml:space="preserve"> Улучшает </w:t>
-      </w:r>
-      <w:r>
-        <w:t>защитную стойку – если начал ход в защитной стойке, то следующая атака нанесёт от 1</w:t>
-      </w:r>
-      <w:r>
-        <w:t>5</w:t>
-      </w:r>
-      <w:r>
-        <w:t xml:space="preserve">0 до </w:t>
-      </w:r>
-      <w:r>
-        <w:t>20</w:t>
-      </w:r>
-      <w:r>
-        <w:t>0% урона.</w:t>
-      </w:r>
-    </w:p>
-    <w:p>
-      <w:r>
-        <w:t>Т2 – таран – Кошмарный всадник</w:t>
-      </w:r>
-    </w:p>
-    <w:p>
-      <w:r>
-        <w:t xml:space="preserve"> Теряет броню, получает свойство кавалерии.</w:t>
-      </w:r>
-    </w:p>
-    <w:p>
-      <w:r>
-        <w:t xml:space="preserve">Т3 – таран – </w:t>
-      </w:r>
-      <w:proofErr w:type="spellStart"/>
-      <w:r>
-        <w:t>Сотрясатель</w:t>
-      </w:r>
-      <w:proofErr w:type="spellEnd"/>
+        <w:t>то эффект всё равно наложится, просто с потерей одного хода от длительности.</w:t>
+      </w:r>
+      <w:r>
+        <w:t xml:space="preserve"> Имеет «Тяжёлый полёт»</w:t>
+      </w:r>
+      <w:r>
+        <w:t>. Иммунитет к огню.</w:t>
+      </w:r>
+    </w:p>
+    <w:p>
+      <w:r>
+        <w:t xml:space="preserve"> Т4 – «огненная ветка» - Игнламинус</w:t>
+      </w:r>
+    </w:p>
+    <w:p>
+      <w:r>
+        <w:t xml:space="preserve"> Более сильная версия фламгладия. Если бьёт цель под действием своего же эффекта урона со временем – наносит дополнительный урон в размере урона от дота.</w:t>
+      </w:r>
       <w:r>
         <w:t xml:space="preserve"> </w:t>
       </w:r>
-    </w:p>
-    <w:p>
-      <w:r>
-        <w:t xml:space="preserve"> Получает иммунитет к разуму, воздуху, воде.</w:t>
-      </w:r>
-    </w:p>
-    <w:p>
-      <w:r>
-        <w:t>Т4 – таран – Покоритель</w:t>
-      </w:r>
-    </w:p>
-    <w:p>
-      <w:r>
-        <w:t xml:space="preserve"> При атаке с разгона может мгновенно убить цель, если у неё остаётся меньше определённого запаса здоровья (растёт с уровнями). Если убивает, встаёт на её место.</w:t>
-      </w:r>
-    </w:p>
-    <w:p/>
-    <w:p>
-      <w:r>
-        <w:t>Крупные демоны</w:t>
-      </w:r>
-      <w:r>
-        <w:t xml:space="preserve"> 7</w:t>
+      <w:r>
+        <w:t>Этот урон – тоже цель для «всепожирающего пламени»</w:t>
+      </w:r>
+    </w:p>
+    <w:p>
+      <w:r>
+        <w:t xml:space="preserve"> Т3 – «контрольная» ветка – Амплифиций</w:t>
       </w:r>
     </w:p>
     <w:p>
@@ -1216,246 +950,13 @@
         <w:t xml:space="preserve"> </w:t>
       </w:r>
       <w:r>
-        <w:t xml:space="preserve">В отличии от прошлой ветки, </w:t>
-      </w:r>
-      <w:proofErr w:type="spellStart"/>
-      <w:r>
-        <w:t>слабобронированны</w:t>
-      </w:r>
-      <w:proofErr w:type="spellEnd"/>
-      <w:r>
-        <w:t xml:space="preserve">, но имеют высокий урон и много </w:t>
-      </w:r>
-      <w:proofErr w:type="spellStart"/>
-      <w:r>
-        <w:t>хп</w:t>
-      </w:r>
-      <w:proofErr w:type="spellEnd"/>
-      <w:r>
-        <w:t xml:space="preserve">. </w:t>
-      </w:r>
-      <w:r>
-        <w:t>Имеют всего 3 ветки, взятых из классической игры. Все достигают ультимативной версии и имеют дополнительные способности.</w:t>
-      </w:r>
-      <w:r>
-        <w:t xml:space="preserve"> Ветки – </w:t>
-      </w:r>
-      <w:r>
-        <w:t>контроль</w:t>
-      </w:r>
-      <w:r>
-        <w:t>, поджог, массовая атака</w:t>
-      </w:r>
-      <w:r>
-        <w:t xml:space="preserve">. Контрольная ветка имеет низкий шанс на накидывание контроля (50% на окаменение), но при этом продляет любые </w:t>
-      </w:r>
-      <w:proofErr w:type="spellStart"/>
-      <w:r>
-        <w:t>дебаффы</w:t>
-      </w:r>
-      <w:proofErr w:type="spellEnd"/>
-      <w:r>
-        <w:t xml:space="preserve"> и доты при ударе. Поджог-ветка предлагает ультимативный урон, совмещённый с дотом, и даёт возможность без потерь урона бить одного юнита. Массово-атакующая ветка наносит сравнительно низкий урон, зато </w:t>
-      </w:r>
-      <w:proofErr w:type="spellStart"/>
-      <w:r>
-        <w:t>синергирует</w:t>
-      </w:r>
-      <w:proofErr w:type="spellEnd"/>
-      <w:r>
-        <w:t xml:space="preserve"> с </w:t>
-      </w:r>
-      <w:proofErr w:type="spellStart"/>
-      <w:r>
-        <w:t>дебаффами</w:t>
-      </w:r>
-      <w:proofErr w:type="spellEnd"/>
-      <w:r>
-        <w:t xml:space="preserve"> и контролем.</w:t>
-      </w:r>
-    </w:p>
-    <w:p>
-      <w:r>
-        <w:t>Т0 – Чёрт</w:t>
-      </w:r>
-    </w:p>
-    <w:p>
-      <w:r>
-        <w:t>Агрессивная версия демона – много урона, мало здоровья для такой туши.</w:t>
-      </w:r>
-      <w:r>
-        <w:t xml:space="preserve"> Имеет «Тяжёлый полёт».</w:t>
-      </w:r>
-    </w:p>
-    <w:p>
-      <w:r>
-        <w:t xml:space="preserve">Т1 </w:t>
-      </w:r>
-      <w:r>
-        <w:t>–</w:t>
-      </w:r>
-      <w:r>
-        <w:t xml:space="preserve"> </w:t>
-      </w:r>
-      <w:r>
-        <w:t>Демон</w:t>
-      </w:r>
-    </w:p>
-    <w:p>
-      <w:r>
-        <w:t>Просто более толстая версия Чёрта. Имеет «Тяжёлый полёт».</w:t>
-      </w:r>
-    </w:p>
-    <w:p>
-      <w:r>
-        <w:t>Т2 – Диссектор</w:t>
-      </w:r>
-    </w:p>
-    <w:p>
-      <w:r>
-        <w:t xml:space="preserve"> Ещё более мощная версия. Наносит бонусный урон (25%) если бьёт по противнику под отрицательным эффектом. Имеет «Тяжёлый полёт».</w:t>
-      </w:r>
-      <w:r>
-        <w:t xml:space="preserve"> </w:t>
-      </w:r>
-      <w:proofErr w:type="spellStart"/>
-      <w:r>
-        <w:t>Имуннен</w:t>
-      </w:r>
-      <w:proofErr w:type="spellEnd"/>
-      <w:r>
-        <w:t xml:space="preserve"> к огню.</w:t>
-      </w:r>
-    </w:p>
-    <w:p>
-      <w:r>
-        <w:t xml:space="preserve">Т3 </w:t>
-      </w:r>
-      <w:r>
-        <w:t>–</w:t>
-      </w:r>
-      <w:r>
-        <w:t xml:space="preserve"> </w:t>
-      </w:r>
-      <w:r>
-        <w:t xml:space="preserve">«массовая» ветка – </w:t>
-      </w:r>
-      <w:proofErr w:type="spellStart"/>
-      <w:r>
-        <w:t>Пронзатель</w:t>
-      </w:r>
-      <w:proofErr w:type="spellEnd"/>
-    </w:p>
-    <w:p>
-      <w:r>
-        <w:t xml:space="preserve"> Атакует всех врагов, физический урон. Наносит бонусный урон (25%) если бьёт по противнику под отрицательным эффектом.</w:t>
-      </w:r>
-      <w:r>
-        <w:t xml:space="preserve"> Низкая инициатива, иммунитет к магии земли</w:t>
-      </w:r>
-    </w:p>
-    <w:p>
-      <w:r>
-        <w:t xml:space="preserve">Т4 – «массовая» ветка – </w:t>
-      </w:r>
-      <w:proofErr w:type="spellStart"/>
-      <w:r>
-        <w:t>Герминарий</w:t>
-      </w:r>
-      <w:proofErr w:type="spellEnd"/>
-    </w:p>
-    <w:p>
-      <w:r>
-        <w:t xml:space="preserve"> Атакует всех врагов, физический урон. Наносит бонусный урон (25%) если бьёт по противнику под отрицательным эффектом. Срывает защитные стойки своим ударом (но урон не увеличивается).</w:t>
-      </w:r>
-    </w:p>
-    <w:p>
-      <w:r>
-        <w:t xml:space="preserve">Т3 – «огненная ветка» - </w:t>
-      </w:r>
-      <w:proofErr w:type="spellStart"/>
-      <w:r>
-        <w:t>Фламгладий</w:t>
-      </w:r>
-      <w:proofErr w:type="spellEnd"/>
-    </w:p>
-    <w:p>
-      <w:r>
-        <w:lastRenderedPageBreak/>
-        <w:t xml:space="preserve"> Атакует одну цель, накладывает на неё урон со временем (огненный). </w:t>
-      </w:r>
-      <w:r>
-        <w:t>Этот урон со временем считается целью для «всепожирающего пламени» - если он остановлен оберегом</w:t>
-      </w:r>
-      <w:r>
-        <w:t>/иммунитетом</w:t>
-      </w:r>
-      <w:r>
-        <w:t>, то эффект всё равно наложится, просто с потерей одного хода от длительности.</w:t>
-      </w:r>
-      <w:r>
-        <w:t xml:space="preserve"> Имеет «Тяжёлый полёт»</w:t>
-      </w:r>
-      <w:r>
-        <w:t>. Иммунитет к огню.</w:t>
-      </w:r>
-    </w:p>
-    <w:p>
-      <w:r>
-        <w:t xml:space="preserve"> Т4 – «огненная ветка» - </w:t>
-      </w:r>
-      <w:proofErr w:type="spellStart"/>
-      <w:r>
-        <w:t>Игнламинус</w:t>
-      </w:r>
-      <w:proofErr w:type="spellEnd"/>
-    </w:p>
-    <w:p>
-      <w:r>
-        <w:t xml:space="preserve"> Более сильная версия </w:t>
-      </w:r>
-      <w:proofErr w:type="spellStart"/>
-      <w:r>
-        <w:t>фламгладия</w:t>
-      </w:r>
-      <w:proofErr w:type="spellEnd"/>
-      <w:r>
-        <w:t>. Если бьёт цель под действием своего же эффекта урона со временем – наносит дополнительный урон в размере урона от дота.</w:t>
-      </w:r>
-      <w:r>
-        <w:t xml:space="preserve"> </w:t>
-      </w:r>
-      <w:r>
-        <w:t>Этот урон – тоже цель для «всепожирающего пламени»</w:t>
-      </w:r>
-    </w:p>
-    <w:p>
-      <w:r>
-        <w:t xml:space="preserve"> Т3 – «контрольная» ветка – </w:t>
-      </w:r>
-      <w:proofErr w:type="spellStart"/>
-      <w:r>
-        <w:t>Амплифиций</w:t>
-      </w:r>
-      <w:proofErr w:type="spellEnd"/>
-    </w:p>
-    <w:p>
-      <w:r>
-        <w:t xml:space="preserve"> </w:t>
-      </w:r>
-      <w:r>
         <w:t xml:space="preserve"> Продляет на 1 ход любые эффекты на противнике, которого ударил. Если эффектов нет, с 50% вероятностью может наложить окаменение на 1 ход. Имеет «Тяжёлый полёт» и иммунитет к разуму.</w:t>
       </w:r>
     </w:p>
     <w:p>
       <w:r>
-        <w:t xml:space="preserve">Т4 – «контрольная» ветка – </w:t>
-      </w:r>
-      <w:proofErr w:type="spellStart"/>
-      <w:r>
-        <w:t>Темпорекс</w:t>
-      </w:r>
-      <w:proofErr w:type="spellEnd"/>
+        <w:t>Т4 – «контрольная» ветка – Темпорекс</w:t>
+      </w:r>
     </w:p>
     <w:p>
       <w:r>

</xml_diff>